<commit_message>
fix: extend API lazy closure rule to 30 days
</commit_message>
<xml_diff>
--- a/docs/book/vol1/EchoInsight_Vol1_Project_Documentation.docx
+++ b/docs/book/vol1/EchoInsight_Vol1_Project_Documentation.docx
@@ -72,18 +72,6 @@
     </w:p>
     <w:p/>
     <w:p>
-      <w:pPr>
-        <w:jc w:val="center"/>
-      </w:pPr>
-      <w:r>
-        <w:rPr>
-          <w:color w:val="808080"/>
-          <w:sz w:val="20"/>
-        </w:rPr>
-        <w:t>Generated: October 06, 2026 | Version 1.0 | Code frozen</w:t>
-      </w:r>
-    </w:p>
-    <w:p>
       <w:r>
         <w:br w:type="page"/>
       </w:r>
@@ -112,16 +100,7 @@
           <w:color w:val="2E75B6"/>
           <w:sz w:val="20"/>
         </w:rPr>
-        <w:t xml:space="preserve">[In one </w:t>
-      </w:r>
-      <w:proofErr w:type="gramStart"/>
-      <w:r>
-        <w:rPr>
-          <w:b/>
-          <w:color w:val="2E75B6"/>
-          <w:sz w:val="20"/>
-        </w:rPr>
-        <w:t xml:space="preserve">sentence]  </w:t>
+        <w:t xml:space="preserve">[In one sentence]  </w:t>
       </w:r>
       <w:proofErr w:type="spellStart"/>
       <w:r>
@@ -132,7 +111,6 @@
         <w:t>EchoInsight</w:t>
       </w:r>
       <w:proofErr w:type="spellEnd"/>
-      <w:proofErr w:type="gramEnd"/>
       <w:r>
         <w:rPr>
           <w:i/>
@@ -2012,7 +1990,6 @@
             <w:tcW w:w="3041" w:type="dxa"/>
           </w:tcPr>
           <w:p>
-            <w:proofErr w:type="gramStart"/>
             <w:r>
               <w:rPr>
                 <w:sz w:val="19"/>
@@ -2024,14 +2001,7 @@
               <w:rPr>
                 <w:sz w:val="19"/>
               </w:rPr>
-              <w:t>env</w:t>
-            </w:r>
-            <w:proofErr w:type="gramEnd"/>
-            <w:r>
-              <w:rPr>
-                <w:sz w:val="19"/>
-              </w:rPr>
-              <w:t>.example</w:t>
+              <w:t>env.example</w:t>
             </w:r>
             <w:proofErr w:type="spellEnd"/>
           </w:p>
@@ -2058,21 +2028,7 @@
               <w:rPr>
                 <w:sz w:val="19"/>
               </w:rPr>
-              <w:t xml:space="preserve">Template for environment variables — copy </w:t>
-            </w:r>
-            <w:proofErr w:type="gramStart"/>
-            <w:r>
-              <w:rPr>
-                <w:sz w:val="19"/>
-              </w:rPr>
-              <w:t>to .env</w:t>
-            </w:r>
-            <w:proofErr w:type="gramEnd"/>
-            <w:r>
-              <w:rPr>
-                <w:sz w:val="19"/>
-              </w:rPr>
-              <w:t xml:space="preserve"> before running</w:t>
+              <w:t>Template for environment variables — copy to .env before running</w:t>
             </w:r>
           </w:p>
         </w:tc>
@@ -2172,7 +2128,6 @@
           </w:tcPr>
           <w:p>
             <w:proofErr w:type="spellStart"/>
-            <w:proofErr w:type="gramStart"/>
             <w:r>
               <w:rPr>
                 <w:sz w:val="19"/>
@@ -2180,7 +2135,6 @@
               <w:t>render.yaml</w:t>
             </w:r>
             <w:proofErr w:type="spellEnd"/>
-            <w:proofErr w:type="gramEnd"/>
           </w:p>
         </w:tc>
         <w:tc>
@@ -2863,7 +2817,6 @@
           </w:tcPr>
           <w:p>
             <w:proofErr w:type="spellStart"/>
-            <w:proofErr w:type="gramStart"/>
             <w:r>
               <w:rPr>
                 <w:sz w:val="19"/>
@@ -2871,7 +2824,6 @@
               <w:t>pyproject.toml</w:t>
             </w:r>
             <w:proofErr w:type="spellEnd"/>
-            <w:proofErr w:type="gramEnd"/>
           </w:p>
         </w:tc>
         <w:tc>
@@ -4009,21 +3961,7 @@
               <w:rPr>
                 <w:sz w:val="19"/>
               </w:rPr>
-              <w:t xml:space="preserve">Exact-quote substring </w:t>
-            </w:r>
-            <w:proofErr w:type="gramStart"/>
-            <w:r>
-              <w:rPr>
-                <w:sz w:val="19"/>
-              </w:rPr>
-              <w:t>check</w:t>
-            </w:r>
-            <w:proofErr w:type="gramEnd"/>
-            <w:r>
-              <w:rPr>
-                <w:sz w:val="19"/>
-              </w:rPr>
-              <w:t xml:space="preserve"> for commitments and QA items</w:t>
+              <w:t>Exact-quote substring check for commitments and QA items</w:t>
             </w:r>
           </w:p>
         </w:tc>
@@ -6785,7 +6723,6 @@
             <w:shd w:val="clear" w:color="auto" w:fill="EBF3FB"/>
           </w:tcPr>
           <w:p>
-            <w:proofErr w:type="gramStart"/>
             <w:r>
               <w:rPr>
                 <w:sz w:val="19"/>
@@ -6800,7 +6737,6 @@
               <w:t>github</w:t>
             </w:r>
             <w:proofErr w:type="spellEnd"/>
-            <w:proofErr w:type="gramEnd"/>
             <w:r>
               <w:rPr>
                 <w:sz w:val="19"/>
@@ -6887,31 +6823,14 @@
           <w:color w:val="2E75B6"/>
           <w:sz w:val="20"/>
         </w:rPr>
-        <w:t xml:space="preserve">[In one </w:t>
-      </w:r>
-      <w:proofErr w:type="gramStart"/>
-      <w:r>
-        <w:rPr>
-          <w:b/>
-          <w:color w:val="2E75B6"/>
-          <w:sz w:val="20"/>
-        </w:rPr>
-        <w:t xml:space="preserve">sentence]  </w:t>
+        <w:t xml:space="preserve">[In one sentence]  </w:t>
       </w:r>
       <w:r>
         <w:rPr>
           <w:i/>
           <w:sz w:val="20"/>
         </w:rPr>
-        <w:t>A</w:t>
-      </w:r>
-      <w:proofErr w:type="gramEnd"/>
-      <w:r>
-        <w:rPr>
-          <w:i/>
-          <w:sz w:val="20"/>
-        </w:rPr>
-        <w:t xml:space="preserve"> supervisor submits a transcript; every turn is redacted, stored, and incrementally </w:t>
+        <w:t xml:space="preserve">A supervisor submits a transcript; every turn is redacted, stored, and incrementally </w:t>
       </w:r>
       <w:proofErr w:type="spellStart"/>
       <w:r>
@@ -7212,23 +7131,7 @@
           <w:rFonts w:ascii="Courier New" w:hAnsi="Courier New"/>
           <w:sz w:val="18"/>
         </w:rPr>
-        <w:t>/v1/conversations/7f3e2a.</w:t>
-      </w:r>
-      <w:proofErr w:type="gramStart"/>
-      <w:r>
-        <w:rPr>
-          <w:rFonts w:ascii="Courier New" w:hAnsi="Courier New"/>
-          <w:sz w:val="18"/>
-        </w:rPr>
-        <w:t>../</w:t>
-      </w:r>
-      <w:proofErr w:type="gramEnd"/>
-      <w:r>
-        <w:rPr>
-          <w:rFonts w:ascii="Courier New" w:hAnsi="Courier New"/>
-          <w:sz w:val="18"/>
-        </w:rPr>
-        <w:t>turns</w:t>
+        <w:t>/v1/conversations/7f3e2a.../turns</w:t>
       </w:r>
       <w:r>
         <w:rPr>
@@ -7372,11 +7275,7 @@
         <w:ind w:left="432"/>
       </w:pPr>
       <w:r>
-        <w:t xml:space="preserve">State merge: </w:t>
-      </w:r>
-      <w:proofErr w:type="gramStart"/>
-      <w:r>
-        <w:t>backend/state/</w:t>
+        <w:t>State merge: backend/state/</w:t>
       </w:r>
       <w:proofErr w:type="spellStart"/>
       <w:r>
@@ -7384,11 +7283,7 @@
       </w:r>
       <w:proofErr w:type="spellEnd"/>
       <w:r>
-        <w:t>(</w:t>
-      </w:r>
-      <w:proofErr w:type="gramEnd"/>
-      <w:r>
-        <w:t xml:space="preserve">) merges the extraction into the running </w:t>
+        <w:t xml:space="preserve">() merges the extraction into the running </w:t>
       </w:r>
       <w:proofErr w:type="spellStart"/>
       <w:r>
@@ -7474,18 +7369,13 @@
       </w:r>
       <w:proofErr w:type="spellStart"/>
       <w:r>
-        <w:t>run_final_</w:t>
-      </w:r>
-      <w:proofErr w:type="gramStart"/>
-      <w:r>
-        <w:t>analysis</w:t>
+        <w:t>run_final_analysis</w:t>
       </w:r>
       <w:proofErr w:type="spellEnd"/>
       <w:r>
         <w:t>(</w:t>
       </w:r>
       <w:proofErr w:type="spellStart"/>
-      <w:proofErr w:type="gramEnd"/>
       <w:r>
         <w:t>conversation_id</w:t>
       </w:r>
@@ -7608,15 +7498,7 @@
         <w:ind w:left="432"/>
       </w:pPr>
       <w:r>
-        <w:t xml:space="preserve">D14 fix: if the LLM returns all-neutral sentiment trajectory (common for polite transcripts), fall back to the incremental </w:t>
-      </w:r>
-      <w:proofErr w:type="gramStart"/>
-      <w:r>
-        <w:t>trajectory built</w:t>
-      </w:r>
-      <w:proofErr w:type="gramEnd"/>
-      <w:r>
-        <w:t xml:space="preserve"> turn-by-turn [pipeline.py:148-171]</w:t>
+        <w:t>D14 fix: if the LLM returns all-neutral sentiment trajectory (common for polite transcripts), fall back to the incremental trajectory built turn-by-turn [pipeline.py:148-171]</w:t>
       </w:r>
     </w:p>
     <w:p>
@@ -7629,19 +7511,11 @@
       </w:r>
       <w:proofErr w:type="spellStart"/>
       <w:r>
-        <w:t>gate_</w:t>
-      </w:r>
-      <w:proofErr w:type="gramStart"/>
-      <w:r>
-        <w:t>commitments</w:t>
+        <w:t>gate_commitments</w:t>
       </w:r>
       <w:proofErr w:type="spellEnd"/>
       <w:r>
-        <w:t>(</w:t>
-      </w:r>
-      <w:proofErr w:type="gramEnd"/>
-      <w:r>
-        <w:t>) checks every quoted text is an exact substring of its referenced turn [evidence_gate.py:19-34]</w:t>
+        <w:t>() checks every quoted text is an exact substring of its referenced turn [evidence_gate.py:19-34]</w:t>
       </w:r>
     </w:p>
     <w:p>
@@ -7679,19 +7553,11 @@
       </w:r>
       <w:proofErr w:type="spellStart"/>
       <w:r>
-        <w:t>gate_qa_</w:t>
-      </w:r>
-      <w:proofErr w:type="gramStart"/>
-      <w:r>
-        <w:t>items</w:t>
+        <w:t>gate_qa_items</w:t>
       </w:r>
       <w:proofErr w:type="spellEnd"/>
       <w:r>
-        <w:t>(</w:t>
-      </w:r>
-      <w:proofErr w:type="gramEnd"/>
-      <w:r>
-        <w:t>) validates every QA quote [evidence_gate.py:37-51]</w:t>
+        <w:t>() validates every QA quote [evidence_gate.py:37-51]</w:t>
       </w:r>
     </w:p>
     <w:p>
@@ -7863,19 +7729,11 @@
       </w:r>
       <w:proofErr w:type="spellStart"/>
       <w:r>
-        <w:t>check_</w:t>
-      </w:r>
-      <w:proofErr w:type="gramStart"/>
-      <w:r>
-        <w:t>quote</w:t>
+        <w:t>check_quote</w:t>
       </w:r>
       <w:proofErr w:type="spellEnd"/>
       <w:r>
-        <w:t>(</w:t>
-      </w:r>
-      <w:proofErr w:type="gramEnd"/>
-      <w:r>
-        <w:t xml:space="preserve">'I guarantee your internet will be fixed by tomorrow', </w:t>
+        <w:t xml:space="preserve">('I guarantee your internet will be fixed by tomorrow', </w:t>
       </w:r>
       <w:proofErr w:type="spellStart"/>
       <w:r>
@@ -7903,19 +7761,11 @@
       </w:r>
       <w:proofErr w:type="spellStart"/>
       <w:r>
-        <w:t>gate_qa_</w:t>
-      </w:r>
-      <w:proofErr w:type="gramStart"/>
-      <w:r>
-        <w:t>items</w:t>
+        <w:t>gate_qa_items</w:t>
       </w:r>
       <w:proofErr w:type="spellEnd"/>
       <w:r>
-        <w:t>(</w:t>
-      </w:r>
-      <w:proofErr w:type="gramEnd"/>
-      <w:r>
-        <w:t>) sets result='</w:t>
+        <w:t>() sets result='</w:t>
       </w:r>
       <w:proofErr w:type="spellStart"/>
       <w:r>
@@ -8702,19 +8552,11 @@
       </w:r>
       <w:proofErr w:type="spellStart"/>
       <w:r>
-        <w:t>get_current_</w:t>
-      </w:r>
-      <w:proofErr w:type="gramStart"/>
-      <w:r>
-        <w:t>user</w:t>
+        <w:t>get_current_user</w:t>
       </w:r>
       <w:proofErr w:type="spellEnd"/>
       <w:r>
-        <w:t>(</w:t>
-      </w:r>
-      <w:proofErr w:type="gramEnd"/>
-      <w:r>
-        <w:t>) decodes JWT, fetches user row, applies role scope</w:t>
+        <w:t>() decodes JWT, fetches user row, applies role scope</w:t>
       </w:r>
     </w:p>
     <w:p>
@@ -8786,15 +8628,7 @@
         <w:ind w:left="432"/>
       </w:pPr>
       <w:r>
-        <w:t>users -- (</w:t>
-      </w:r>
-      <w:proofErr w:type="gramStart"/>
-      <w:r>
-        <w:t>1:N</w:t>
-      </w:r>
-      <w:proofErr w:type="gramEnd"/>
-      <w:r>
-        <w:t>) --&gt; agents (optional user-to-agent link)</w:t>
+        <w:t>users -- (1:N) --&gt; agents (optional user-to-agent link)</w:t>
       </w:r>
     </w:p>
     <w:p>
@@ -8803,15 +8637,7 @@
         <w:ind w:left="432"/>
       </w:pPr>
       <w:r>
-        <w:t>teams -- (</w:t>
-      </w:r>
-      <w:proofErr w:type="gramStart"/>
-      <w:r>
-        <w:t>1:N</w:t>
-      </w:r>
-      <w:proofErr w:type="gramEnd"/>
-      <w:r>
-        <w:t>) --&gt; agents</w:t>
+        <w:t>teams -- (1:N) --&gt; agents</w:t>
       </w:r>
     </w:p>
     <w:p>
@@ -8820,15 +8646,7 @@
         <w:ind w:left="432"/>
       </w:pPr>
       <w:r>
-        <w:t>conversations -- (</w:t>
-      </w:r>
-      <w:proofErr w:type="gramStart"/>
-      <w:r>
-        <w:t>1:N</w:t>
-      </w:r>
-      <w:proofErr w:type="gramEnd"/>
-      <w:r>
-        <w:t>) --&gt; turns, analyses, jobs, segments, commitments (provisional)</w:t>
+        <w:t>conversations -- (1:N) --&gt; turns, analyses, jobs, segments, commitments (provisional)</w:t>
       </w:r>
     </w:p>
     <w:p>
@@ -8870,15 +8688,7 @@
       </w:r>
       <w:proofErr w:type="spellEnd"/>
       <w:r>
-        <w:t xml:space="preserve"> -- (</w:t>
-      </w:r>
-      <w:proofErr w:type="gramStart"/>
-      <w:r>
-        <w:t>1:N</w:t>
-      </w:r>
-      <w:proofErr w:type="gramEnd"/>
-      <w:r>
-        <w:t xml:space="preserve">) --&gt; </w:t>
+        <w:t xml:space="preserve"> -- (1:N) --&gt; </w:t>
       </w:r>
       <w:proofErr w:type="spellStart"/>
       <w:r>
@@ -8886,15 +8696,7 @@
       </w:r>
       <w:proofErr w:type="spellEnd"/>
       <w:r>
-        <w:t xml:space="preserve"> -- (</w:t>
-      </w:r>
-      <w:proofErr w:type="gramStart"/>
-      <w:r>
-        <w:t>1:N</w:t>
-      </w:r>
-      <w:proofErr w:type="gramEnd"/>
-      <w:r>
-        <w:t xml:space="preserve">) --&gt; </w:t>
+        <w:t xml:space="preserve"> -- (1:N) --&gt; </w:t>
       </w:r>
       <w:proofErr w:type="spellStart"/>
       <w:r>
@@ -8916,15 +8718,7 @@
       </w:r>
       <w:proofErr w:type="spellEnd"/>
       <w:r>
-        <w:t xml:space="preserve"> -- (</w:t>
-      </w:r>
-      <w:proofErr w:type="gramStart"/>
-      <w:r>
-        <w:t>1:N</w:t>
-      </w:r>
-      <w:proofErr w:type="gramEnd"/>
-      <w:r>
-        <w:t xml:space="preserve">) --&gt; </w:t>
+        <w:t xml:space="preserve"> -- (1:N) --&gt; </w:t>
       </w:r>
       <w:proofErr w:type="spellStart"/>
       <w:r>
@@ -10606,16 +10400,444 @@
         </w:tc>
       </w:tr>
     </w:tbl>
-    <w:p/>
+    <w:p>
+      <w:pPr>
+        <w:rPr>
+          <w:sz w:val="24"/>
+          <w:szCs w:val="24"/>
+          <w:u w:val="single"/>
+        </w:rPr>
+      </w:pPr>
+      <w:r>
+        <w:rPr>
+          <w:sz w:val="24"/>
+          <w:szCs w:val="24"/>
+          <w:u w:val="single"/>
+        </w:rPr>
+        <w:t>Testing the retrieval of data from SQL:</w:t>
+      </w:r>
+    </w:p>
+    <w:p>
+      <w:pPr>
+        <w:rPr>
+          <w:sz w:val="20"/>
+          <w:szCs w:val="20"/>
+        </w:rPr>
+      </w:pPr>
+      <w:r>
+        <w:rPr>
+          <w:sz w:val="20"/>
+          <w:szCs w:val="20"/>
+        </w:rPr>
+        <w:t xml:space="preserve">1. View Users and their </w:t>
+      </w:r>
+      <w:proofErr w:type="spellStart"/>
+      <w:r>
+        <w:rPr>
+          <w:sz w:val="20"/>
+          <w:szCs w:val="20"/>
+        </w:rPr>
+        <w:t>Roles</w:t>
+      </w:r>
+      <w:r>
+        <w:rPr>
+          <w:sz w:val="20"/>
+          <w:szCs w:val="20"/>
+        </w:rPr>
+        <w:t>:</w:t>
+      </w:r>
+      <w:r>
+        <w:rPr>
+          <w:sz w:val="20"/>
+          <w:szCs w:val="20"/>
+        </w:rPr>
+        <w:t>Check</w:t>
+      </w:r>
+      <w:proofErr w:type="spellEnd"/>
+      <w:r>
+        <w:rPr>
+          <w:sz w:val="20"/>
+          <w:szCs w:val="20"/>
+        </w:rPr>
+        <w:t xml:space="preserve"> the users table to see who has been created, their roles, and if they are assigned to an agent or team:</w:t>
+      </w:r>
+      <w:r>
+        <w:rPr>
+          <w:sz w:val="20"/>
+          <w:szCs w:val="20"/>
+        </w:rPr>
+        <w:br/>
+      </w:r>
+    </w:p>
+    <w:p>
+      <w:r>
+        <w:rPr>
+          <w:noProof/>
+        </w:rPr>
+        <w:drawing>
+          <wp:inline distT="0" distB="0" distL="0" distR="0" wp14:anchorId="50226383" wp14:editId="54EB9AF8">
+            <wp:extent cx="5045078" cy="4261449"/>
+            <wp:effectExtent l="0" t="0" r="3175" b="6350"/>
+            <wp:docPr id="1801457558" name="Picture 1"/>
+            <wp:cNvGraphicFramePr>
+              <a:graphicFrameLocks xmlns:a="http://schemas.openxmlformats.org/drawingml/2006/main" noChangeAspect="1"/>
+            </wp:cNvGraphicFramePr>
+            <a:graphic xmlns:a="http://schemas.openxmlformats.org/drawingml/2006/main">
+              <a:graphicData uri="http://schemas.openxmlformats.org/drawingml/2006/picture">
+                <pic:pic xmlns:pic="http://schemas.openxmlformats.org/drawingml/2006/picture">
+                  <pic:nvPicPr>
+                    <pic:cNvPr id="1801457558" name=""/>
+                    <pic:cNvPicPr/>
+                  </pic:nvPicPr>
+                  <pic:blipFill>
+                    <a:blip r:embed="rId10"/>
+                    <a:stretch>
+                      <a:fillRect/>
+                    </a:stretch>
+                  </pic:blipFill>
+                  <pic:spPr>
+                    <a:xfrm>
+                      <a:off x="0" y="0"/>
+                      <a:ext cx="5049936" cy="4265553"/>
+                    </a:xfrm>
+                    <a:prstGeom prst="rect">
+                      <a:avLst/>
+                    </a:prstGeom>
+                  </pic:spPr>
+                </pic:pic>
+              </a:graphicData>
+            </a:graphic>
+          </wp:inline>
+        </w:drawing>
+      </w:r>
+    </w:p>
+    <w:p>
+      <w:r>
+        <w:lastRenderedPageBreak/>
+        <w:t>2. View Recent Conversations</w:t>
+      </w:r>
+      <w:r>
+        <w:t xml:space="preserve"> - </w:t>
+      </w:r>
+      <w:r>
+        <w:t>Retrieve the most recent conversations along with their status and channel</w:t>
+      </w:r>
+    </w:p>
+    <w:p>
+      <w:r>
+        <w:rPr>
+          <w:noProof/>
+        </w:rPr>
+        <w:drawing>
+          <wp:inline distT="0" distB="0" distL="0" distR="0" wp14:anchorId="7F1036CA" wp14:editId="2DB7C6EB">
+            <wp:extent cx="6858000" cy="3338195"/>
+            <wp:effectExtent l="0" t="0" r="0" b="0"/>
+            <wp:docPr id="1078928020" name="Picture 1"/>
+            <wp:cNvGraphicFramePr>
+              <a:graphicFrameLocks xmlns:a="http://schemas.openxmlformats.org/drawingml/2006/main" noChangeAspect="1"/>
+            </wp:cNvGraphicFramePr>
+            <a:graphic xmlns:a="http://schemas.openxmlformats.org/drawingml/2006/main">
+              <a:graphicData uri="http://schemas.openxmlformats.org/drawingml/2006/picture">
+                <pic:pic xmlns:pic="http://schemas.openxmlformats.org/drawingml/2006/picture">
+                  <pic:nvPicPr>
+                    <pic:cNvPr id="1078928020" name=""/>
+                    <pic:cNvPicPr/>
+                  </pic:nvPicPr>
+                  <pic:blipFill>
+                    <a:blip r:embed="rId11"/>
+                    <a:stretch>
+                      <a:fillRect/>
+                    </a:stretch>
+                  </pic:blipFill>
+                  <pic:spPr>
+                    <a:xfrm>
+                      <a:off x="0" y="0"/>
+                      <a:ext cx="6858000" cy="3338195"/>
+                    </a:xfrm>
+                    <a:prstGeom prst="rect">
+                      <a:avLst/>
+                    </a:prstGeom>
+                  </pic:spPr>
+                </pic:pic>
+              </a:graphicData>
+            </a:graphic>
+          </wp:inline>
+        </w:drawing>
+      </w:r>
+    </w:p>
+    <w:p>
+      <w:r>
+        <w:t xml:space="preserve">3. </w:t>
+      </w:r>
+      <w:r>
+        <w:t>Read Conversation Transcript (Turns)</w:t>
+      </w:r>
+      <w:r>
+        <w:t xml:space="preserve"> - </w:t>
+      </w:r>
+      <w:r>
+        <w:t>To see what was actually said in a specific conversation, you can fetch its turns (messages) ordered by their sequence.</w:t>
+      </w:r>
+    </w:p>
+    <w:p>
+      <w:r>
+        <w:rPr>
+          <w:noProof/>
+        </w:rPr>
+        <w:drawing>
+          <wp:inline distT="0" distB="0" distL="0" distR="0" wp14:anchorId="651550F5" wp14:editId="50710B16">
+            <wp:extent cx="6858000" cy="4761230"/>
+            <wp:effectExtent l="0" t="0" r="0" b="1270"/>
+            <wp:docPr id="1751447404" name="Picture 1"/>
+            <wp:cNvGraphicFramePr>
+              <a:graphicFrameLocks xmlns:a="http://schemas.openxmlformats.org/drawingml/2006/main" noChangeAspect="1"/>
+            </wp:cNvGraphicFramePr>
+            <a:graphic xmlns:a="http://schemas.openxmlformats.org/drawingml/2006/main">
+              <a:graphicData uri="http://schemas.openxmlformats.org/drawingml/2006/picture">
+                <pic:pic xmlns:pic="http://schemas.openxmlformats.org/drawingml/2006/picture">
+                  <pic:nvPicPr>
+                    <pic:cNvPr id="1751447404" name=""/>
+                    <pic:cNvPicPr/>
+                  </pic:nvPicPr>
+                  <pic:blipFill>
+                    <a:blip r:embed="rId12"/>
+                    <a:stretch>
+                      <a:fillRect/>
+                    </a:stretch>
+                  </pic:blipFill>
+                  <pic:spPr>
+                    <a:xfrm>
+                      <a:off x="0" y="0"/>
+                      <a:ext cx="6858000" cy="4761230"/>
+                    </a:xfrm>
+                    <a:prstGeom prst="rect">
+                      <a:avLst/>
+                    </a:prstGeom>
+                  </pic:spPr>
+                </pic:pic>
+              </a:graphicData>
+            </a:graphic>
+          </wp:inline>
+        </w:drawing>
+      </w:r>
+    </w:p>
+    <w:p>
+      <w:pPr>
+        <w:pStyle w:val="Heading3"/>
+        <w:rPr>
+          <w:rFonts w:ascii="Calibri" w:eastAsiaTheme="minorEastAsia" w:hAnsi="Calibri" w:cstheme="minorBidi"/>
+          <w:b w:val="0"/>
+          <w:bCs w:val="0"/>
+          <w:color w:val="auto"/>
+          <w:sz w:val="22"/>
+        </w:rPr>
+      </w:pPr>
+      <w:r>
+        <w:rPr>
+          <w:rFonts w:ascii="Calibri" w:eastAsiaTheme="minorEastAsia" w:hAnsi="Calibri" w:cstheme="minorBidi"/>
+          <w:b w:val="0"/>
+          <w:bCs w:val="0"/>
+          <w:color w:val="auto"/>
+          <w:sz w:val="22"/>
+        </w:rPr>
+        <w:lastRenderedPageBreak/>
+        <w:t>4. Check Analysis &amp; QA Results - If your AI has processed any conversations, you can see the risk, resolution, and QA scores:</w:t>
+      </w:r>
+    </w:p>
     <w:p>
       <w:pPr>
         <w:pStyle w:val="Heading3"/>
       </w:pPr>
       <w:r>
-        <w:t>SQLite vs PostgreSQL</w:t>
+        <w:rPr>
+          <w:noProof/>
+        </w:rPr>
+        <w:drawing>
+          <wp:inline distT="0" distB="0" distL="0" distR="0" wp14:anchorId="61F39B2F" wp14:editId="0F143CB0">
+            <wp:extent cx="6858000" cy="4299585"/>
+            <wp:effectExtent l="0" t="0" r="0" b="5715"/>
+            <wp:docPr id="2125839460" name="Picture 1"/>
+            <wp:cNvGraphicFramePr>
+              <a:graphicFrameLocks xmlns:a="http://schemas.openxmlformats.org/drawingml/2006/main" noChangeAspect="1"/>
+            </wp:cNvGraphicFramePr>
+            <a:graphic xmlns:a="http://schemas.openxmlformats.org/drawingml/2006/main">
+              <a:graphicData uri="http://schemas.openxmlformats.org/drawingml/2006/picture">
+                <pic:pic xmlns:pic="http://schemas.openxmlformats.org/drawingml/2006/picture">
+                  <pic:nvPicPr>
+                    <pic:cNvPr id="2125839460" name=""/>
+                    <pic:cNvPicPr/>
+                  </pic:nvPicPr>
+                  <pic:blipFill>
+                    <a:blip r:embed="rId13"/>
+                    <a:stretch>
+                      <a:fillRect/>
+                    </a:stretch>
+                  </pic:blipFill>
+                  <pic:spPr>
+                    <a:xfrm>
+                      <a:off x="0" y="0"/>
+                      <a:ext cx="6858000" cy="4299585"/>
+                    </a:xfrm>
+                    <a:prstGeom prst="rect">
+                      <a:avLst/>
+                    </a:prstGeom>
+                  </pic:spPr>
+                </pic:pic>
+              </a:graphicData>
+            </a:graphic>
+          </wp:inline>
+        </w:drawing>
       </w:r>
     </w:p>
     <w:p>
+      <w:pPr>
+        <w:pStyle w:val="Heading3"/>
+        <w:rPr>
+          <w:rFonts w:ascii="Calibri" w:eastAsiaTheme="minorEastAsia" w:hAnsi="Calibri" w:cstheme="minorBidi"/>
+          <w:b w:val="0"/>
+          <w:bCs w:val="0"/>
+          <w:color w:val="auto"/>
+          <w:sz w:val="22"/>
+        </w:rPr>
+      </w:pPr>
+      <w:r>
+        <w:rPr>
+          <w:rFonts w:ascii="Calibri" w:eastAsiaTheme="minorEastAsia" w:hAnsi="Calibri" w:cstheme="minorBidi"/>
+          <w:b w:val="0"/>
+          <w:bCs w:val="0"/>
+          <w:color w:val="auto"/>
+          <w:sz w:val="22"/>
+        </w:rPr>
+        <w:t>5. Check Active QA Checklist Versions - If you want to verify which QA checklist is currently active for evaluating the conversations:</w:t>
+      </w:r>
+    </w:p>
+    <w:p>
+      <w:pPr>
+        <w:pStyle w:val="Heading3"/>
+      </w:pPr>
+      <w:r>
+        <w:rPr>
+          <w:noProof/>
+        </w:rPr>
+        <w:drawing>
+          <wp:inline distT="0" distB="0" distL="0" distR="0" wp14:anchorId="2964FABD" wp14:editId="382B4633">
+            <wp:extent cx="6858000" cy="3249295"/>
+            <wp:effectExtent l="0" t="0" r="0" b="8255"/>
+            <wp:docPr id="1701556012" name="Picture 1"/>
+            <wp:cNvGraphicFramePr>
+              <a:graphicFrameLocks xmlns:a="http://schemas.openxmlformats.org/drawingml/2006/main" noChangeAspect="1"/>
+            </wp:cNvGraphicFramePr>
+            <a:graphic xmlns:a="http://schemas.openxmlformats.org/drawingml/2006/main">
+              <a:graphicData uri="http://schemas.openxmlformats.org/drawingml/2006/picture">
+                <pic:pic xmlns:pic="http://schemas.openxmlformats.org/drawingml/2006/picture">
+                  <pic:nvPicPr>
+                    <pic:cNvPr id="1701556012" name=""/>
+                    <pic:cNvPicPr/>
+                  </pic:nvPicPr>
+                  <pic:blipFill>
+                    <a:blip r:embed="rId14"/>
+                    <a:stretch>
+                      <a:fillRect/>
+                    </a:stretch>
+                  </pic:blipFill>
+                  <pic:spPr>
+                    <a:xfrm>
+                      <a:off x="0" y="0"/>
+                      <a:ext cx="6858000" cy="3249295"/>
+                    </a:xfrm>
+                    <a:prstGeom prst="rect">
+                      <a:avLst/>
+                    </a:prstGeom>
+                  </pic:spPr>
+                </pic:pic>
+              </a:graphicData>
+            </a:graphic>
+          </wp:inline>
+        </w:drawing>
+      </w:r>
+    </w:p>
+    <w:p>
+      <w:pPr>
+        <w:pStyle w:val="Heading3"/>
+      </w:pPr>
+    </w:p>
+    <w:p>
+      <w:pPr>
+        <w:pStyle w:val="Heading3"/>
+        <w:rPr>
+          <w:rFonts w:ascii="Calibri" w:eastAsiaTheme="minorEastAsia" w:hAnsi="Calibri" w:cstheme="minorBidi"/>
+          <w:b w:val="0"/>
+          <w:bCs w:val="0"/>
+          <w:color w:val="auto"/>
+          <w:sz w:val="22"/>
+        </w:rPr>
+      </w:pPr>
+      <w:r>
+        <w:rPr>
+          <w:rFonts w:ascii="Calibri" w:eastAsiaTheme="minorEastAsia" w:hAnsi="Calibri" w:cstheme="minorBidi"/>
+          <w:b w:val="0"/>
+          <w:bCs w:val="0"/>
+          <w:color w:val="auto"/>
+          <w:sz w:val="22"/>
+        </w:rPr>
+        <w:lastRenderedPageBreak/>
+        <w:t>6. View Tracked Commitments (Follow-ups) - Check if any follow-up actions or commitments were extracted from conversations</w:t>
+      </w:r>
+    </w:p>
+    <w:p>
+      <w:pPr>
+        <w:pStyle w:val="Heading3"/>
+      </w:pPr>
+      <w:r>
+        <w:rPr>
+          <w:noProof/>
+        </w:rPr>
+        <w:drawing>
+          <wp:inline distT="0" distB="0" distL="0" distR="0" wp14:anchorId="568F20EF" wp14:editId="24F20FEE">
+            <wp:extent cx="6858000" cy="2934335"/>
+            <wp:effectExtent l="0" t="0" r="0" b="0"/>
+            <wp:docPr id="2095172830" name="Picture 1"/>
+            <wp:cNvGraphicFramePr>
+              <a:graphicFrameLocks xmlns:a="http://schemas.openxmlformats.org/drawingml/2006/main" noChangeAspect="1"/>
+            </wp:cNvGraphicFramePr>
+            <a:graphic xmlns:a="http://schemas.openxmlformats.org/drawingml/2006/main">
+              <a:graphicData uri="http://schemas.openxmlformats.org/drawingml/2006/picture">
+                <pic:pic xmlns:pic="http://schemas.openxmlformats.org/drawingml/2006/picture">
+                  <pic:nvPicPr>
+                    <pic:cNvPr id="2095172830" name=""/>
+                    <pic:cNvPicPr/>
+                  </pic:nvPicPr>
+                  <pic:blipFill>
+                    <a:blip r:embed="rId15"/>
+                    <a:stretch>
+                      <a:fillRect/>
+                    </a:stretch>
+                  </pic:blipFill>
+                  <pic:spPr>
+                    <a:xfrm>
+                      <a:off x="0" y="0"/>
+                      <a:ext cx="6858000" cy="2934335"/>
+                    </a:xfrm>
+                    <a:prstGeom prst="rect">
+                      <a:avLst/>
+                    </a:prstGeom>
+                  </pic:spPr>
+                </pic:pic>
+              </a:graphicData>
+            </a:graphic>
+          </wp:inline>
+        </w:drawing>
+      </w:r>
+    </w:p>
+    <w:p>
+      <w:pPr>
+        <w:pStyle w:val="Heading3"/>
+      </w:pPr>
+      <w:r>
+        <w:t>SQLite vs PostgreSQL</w:t>
+      </w:r>
+    </w:p>
+    <w:p>
       <w:r>
         <w:t>In development and demo mode the app uses SQLite (</w:t>
       </w:r>
@@ -10645,19 +10867,11 @@
       </w:r>
       <w:proofErr w:type="spellStart"/>
       <w:r>
-        <w:t>auto_</w:t>
-      </w:r>
-      <w:proofErr w:type="gramStart"/>
-      <w:r>
-        <w:t>migrate</w:t>
+        <w:t>auto_migrate</w:t>
       </w:r>
       <w:proofErr w:type="spellEnd"/>
       <w:r>
-        <w:t>(</w:t>
-      </w:r>
-      <w:proofErr w:type="gramEnd"/>
-      <w:r>
-        <w:t>) helper adds missing columns on every startup to keep schemas in sync without Alembic [backend/</w:t>
+        <w:t>() helper adds missing columns on every startup to keep schemas in sync without Alembic [backend/</w:t>
       </w:r>
       <w:proofErr w:type="spellStart"/>
       <w:r>
@@ -10670,22 +10884,18 @@
     </w:p>
     <w:p>
       <w:proofErr w:type="spellStart"/>
-      <w:proofErr w:type="gramStart"/>
       <w:r>
         <w:t>sa.JSON</w:t>
       </w:r>
       <w:proofErr w:type="spellEnd"/>
-      <w:proofErr w:type="gramEnd"/>
       <w:r>
         <w:t xml:space="preserve"> is used for all JSON columns so they work on both backends [backend/models.py, README.md]. This was a deliberate choice to avoid </w:t>
       </w:r>
       <w:proofErr w:type="spellStart"/>
-      <w:proofErr w:type="gramStart"/>
       <w:r>
         <w:t>sa.JSONB</w:t>
       </w:r>
       <w:proofErr w:type="spellEnd"/>
-      <w:proofErr w:type="gramEnd"/>
       <w:r>
         <w:t xml:space="preserve"> which is PostgreSQL-specific [ADR-004 inferred].</w:t>
       </w:r>
@@ -12037,21 +12247,7 @@
                 <w:sz w:val="19"/>
               </w:rPr>
               <w:lastRenderedPageBreak/>
-              <w:t xml:space="preserve">Standalone </w:t>
-            </w:r>
-            <w:proofErr w:type="gramStart"/>
-            <w:r>
-              <w:rPr>
-                <w:sz w:val="19"/>
-              </w:rPr>
-              <w:t>8-12 digit</w:t>
-            </w:r>
-            <w:proofErr w:type="gramEnd"/>
-            <w:r>
-              <w:rPr>
-                <w:sz w:val="19"/>
-              </w:rPr>
-              <w:t xml:space="preserve"> numbers</w:t>
+              <w:t>Standalone 8-12 digit numbers</w:t>
             </w:r>
           </w:p>
         </w:tc>
@@ -12093,21 +12289,7 @@
               <w:rPr>
                 <w:sz w:val="19"/>
               </w:rPr>
-              <w:t>Phone numbers (</w:t>
-            </w:r>
-            <w:proofErr w:type="gramStart"/>
-            <w:r>
-              <w:rPr>
-                <w:sz w:val="19"/>
-              </w:rPr>
-              <w:t>7-10 digit</w:t>
-            </w:r>
-            <w:proofErr w:type="gramEnd"/>
-            <w:r>
-              <w:rPr>
-                <w:sz w:val="19"/>
-              </w:rPr>
-              <w:t xml:space="preserve"> patterns)</w:t>
+              <w:t>Phone numbers (7-10 digit patterns)</w:t>
             </w:r>
           </w:p>
         </w:tc>
@@ -12372,19 +12554,11 @@
       </w:r>
       <w:proofErr w:type="spellStart"/>
       <w:r>
-        <w:t>Turn.compute_content_</w:t>
-      </w:r>
-      <w:proofErr w:type="gramStart"/>
-      <w:r>
-        <w:t>hash</w:t>
+        <w:t>Turn.compute_content_hash</w:t>
       </w:r>
       <w:proofErr w:type="spellEnd"/>
       <w:r>
-        <w:t>(</w:t>
-      </w:r>
-      <w:proofErr w:type="gramEnd"/>
-      <w:r>
-        <w:t>)].</w:t>
+        <w:t>()].</w:t>
       </w:r>
     </w:p>
     <w:p>
@@ -12477,13 +12651,8 @@
         <w:t>response_format</w:t>
       </w:r>
       <w:proofErr w:type="spellEnd"/>
-      <w:proofErr w:type="gramStart"/>
-      <w:r>
-        <w:t>={</w:t>
-      </w:r>
-      <w:proofErr w:type="gramEnd"/>
-      <w:r>
-        <w:t>'type': '</w:t>
+      <w:r>
+        <w:t>={'type': '</w:t>
       </w:r>
       <w:proofErr w:type="spellStart"/>
       <w:r>
@@ -12513,19 +12682,11 @@
       </w:r>
       <w:proofErr w:type="spellStart"/>
       <w:r>
-        <w:t>check_</w:t>
-      </w:r>
-      <w:proofErr w:type="gramStart"/>
-      <w:r>
-        <w:t>budget</w:t>
+        <w:t>check_budget</w:t>
       </w:r>
       <w:proofErr w:type="spellEnd"/>
       <w:r>
-        <w:t>(</w:t>
-      </w:r>
-      <w:proofErr w:type="gramEnd"/>
-      <w:r>
-        <w:t xml:space="preserve">) raises </w:t>
+        <w:t xml:space="preserve">() raises </w:t>
       </w:r>
       <w:proofErr w:type="spellStart"/>
       <w:r>
@@ -12537,19 +12698,11 @@
       </w:r>
       <w:proofErr w:type="spellStart"/>
       <w:r>
-        <w:t>check_and_</w:t>
-      </w:r>
-      <w:proofErr w:type="gramStart"/>
-      <w:r>
-        <w:t>record</w:t>
+        <w:t>check_and_record</w:t>
       </w:r>
       <w:proofErr w:type="spellEnd"/>
       <w:r>
-        <w:t>(</w:t>
-      </w:r>
-      <w:proofErr w:type="gramEnd"/>
-      <w:r>
-        <w:t xml:space="preserve">) adds </w:t>
+        <w:t xml:space="preserve">() adds </w:t>
       </w:r>
       <w:proofErr w:type="spellStart"/>
       <w:r>
@@ -13628,23 +13781,7 @@
       </w:r>
       <w:proofErr w:type="spellEnd"/>
       <w:r>
-        <w:t xml:space="preserve"> = True, score = </w:t>
-      </w:r>
-      <w:proofErr w:type="gramStart"/>
-      <w:r>
-        <w:t>min(</w:t>
-      </w:r>
-      <w:proofErr w:type="gramEnd"/>
-      <w:r>
-        <w:t>score, 60) regardless of other results [scorer.py:80-97, checklist_v</w:t>
-      </w:r>
-      <w:proofErr w:type="gramStart"/>
-      <w:r>
-        <w:t>1.yaml</w:t>
-      </w:r>
-      <w:proofErr w:type="gramEnd"/>
-      <w:r>
-        <w:t>:127].</w:t>
+        <w:t xml:space="preserve"> = True, score = min(score, 60) regardless of other results [scorer.py:80-97, checklist_v1.yaml:127].</w:t>
       </w:r>
     </w:p>
     <w:p>
@@ -13657,15 +13794,7 @@
     </w:p>
     <w:p>
       <w:r>
-        <w:t>Suppose: greeting=</w:t>
-      </w:r>
-      <w:proofErr w:type="gramStart"/>
-      <w:r>
-        <w:t>pass(</w:t>
-      </w:r>
-      <w:proofErr w:type="gramEnd"/>
-      <w:r>
-        <w:t xml:space="preserve">1.0), </w:t>
+        <w:t xml:space="preserve">Suppose: greeting=pass(1.0), </w:t>
       </w:r>
       <w:proofErr w:type="spellStart"/>
       <w:r>
@@ -13673,15 +13802,7 @@
       </w:r>
       <w:proofErr w:type="spellEnd"/>
       <w:r>
-        <w:t>=</w:t>
-      </w:r>
-      <w:proofErr w:type="gramStart"/>
-      <w:r>
-        <w:t>fail(</w:t>
-      </w:r>
-      <w:proofErr w:type="gramEnd"/>
-      <w:r>
-        <w:t>2.0, critical), empathy=</w:t>
+        <w:t>=fail(2.0, critical), empathy=</w:t>
       </w:r>
       <w:proofErr w:type="spellStart"/>
       <w:r>
@@ -13689,15 +13810,7 @@
       </w:r>
       <w:proofErr w:type="spellEnd"/>
       <w:r>
-        <w:t>, disclosure=</w:t>
-      </w:r>
-      <w:proofErr w:type="gramStart"/>
-      <w:r>
-        <w:t>pass(</w:t>
-      </w:r>
-      <w:proofErr w:type="gramEnd"/>
-      <w:r>
-        <w:t xml:space="preserve">1.5), </w:t>
+        <w:t xml:space="preserve">, disclosure=pass(1.5), </w:t>
       </w:r>
       <w:proofErr w:type="spellStart"/>
       <w:r>
@@ -13705,31 +13818,15 @@
       </w:r>
       <w:proofErr w:type="spellEnd"/>
       <w:r>
-        <w:t>=</w:t>
-      </w:r>
-      <w:proofErr w:type="gramStart"/>
-      <w:r>
-        <w:t>pass(</w:t>
-      </w:r>
-      <w:proofErr w:type="gramEnd"/>
-      <w:r>
-        <w:t>2.0), closure=</w:t>
+        <w:t>=pass(2.0), closure=</w:t>
       </w:r>
       <w:proofErr w:type="spellStart"/>
       <w:r>
-        <w:t>needs_</w:t>
-      </w:r>
-      <w:proofErr w:type="gramStart"/>
-      <w:r>
-        <w:t>review</w:t>
+        <w:t>needs_review</w:t>
       </w:r>
       <w:proofErr w:type="spellEnd"/>
       <w:r>
-        <w:t>(</w:t>
-      </w:r>
-      <w:proofErr w:type="gramEnd"/>
-      <w:r>
-        <w:t>1.0).</w:t>
+        <w:t>(1.0).</w:t>
       </w:r>
     </w:p>
     <w:p>
@@ -13820,15 +13917,7 @@
       </w:r>
       <w:proofErr w:type="spellEnd"/>
       <w:r>
-        <w:t xml:space="preserve"> failed), so score = </w:t>
-      </w:r>
-      <w:proofErr w:type="gramStart"/>
-      <w:r>
-        <w:t>min(</w:t>
-      </w:r>
-      <w:proofErr w:type="gramEnd"/>
-      <w:r>
-        <w:t>69.2, 60) = 60</w:t>
+        <w:t xml:space="preserve"> failed), so score = min(69.2, 60) = 60</w:t>
       </w:r>
     </w:p>
     <w:p>
@@ -14207,16 +14296,8 @@
               <w:rPr>
                 <w:sz w:val="19"/>
               </w:rPr>
-              <w:t>/</w:t>
-            </w:r>
-            <w:proofErr w:type="gramStart"/>
-            <w:r>
-              <w:rPr>
-                <w:sz w:val="19"/>
-              </w:rPr>
-              <w:t>health</w:t>
-            </w:r>
-            <w:proofErr w:type="gramEnd"/>
+              <w:t>/health</w:t>
+            </w:r>
           </w:p>
         </w:tc>
         <w:tc>
@@ -14271,16 +14352,8 @@
               <w:rPr>
                 <w:sz w:val="19"/>
               </w:rPr>
-              <w:t>/</w:t>
-            </w:r>
-            <w:proofErr w:type="gramStart"/>
-            <w:r>
-              <w:rPr>
-                <w:sz w:val="19"/>
-              </w:rPr>
-              <w:t>ready</w:t>
-            </w:r>
-            <w:proofErr w:type="gramEnd"/>
+              <w:t>/ready</w:t>
+            </w:r>
           </w:p>
         </w:tc>
         <w:tc>
@@ -15547,16 +15620,8 @@
               <w:rPr>
                 <w:sz w:val="19"/>
               </w:rPr>
-              <w:t>/</w:t>
-            </w:r>
-            <w:proofErr w:type="gramStart"/>
-            <w:r>
-              <w:rPr>
-                <w:sz w:val="19"/>
-              </w:rPr>
-              <w:t>metrics</w:t>
-            </w:r>
-            <w:proofErr w:type="gramEnd"/>
+              <w:t>/metrics</w:t>
+            </w:r>
           </w:p>
         </w:tc>
         <w:tc>
@@ -15844,19 +15909,11 @@
             <w:tcW w:w="2280" w:type="dxa"/>
           </w:tcPr>
           <w:p>
-            <w:proofErr w:type="gramStart"/>
-            <w:r>
-              <w:rPr>
-                <w:sz w:val="19"/>
-              </w:rPr>
-              <w:t>AVG(</w:t>
-            </w:r>
-            <w:proofErr w:type="gramEnd"/>
-            <w:r>
-              <w:rPr>
-                <w:sz w:val="19"/>
-              </w:rPr>
-              <w:t xml:space="preserve">score) from </w:t>
+            <w:r>
+              <w:rPr>
+                <w:sz w:val="19"/>
+              </w:rPr>
+              <w:t xml:space="preserve">AVG(score) from </w:t>
             </w:r>
             <w:proofErr w:type="spellStart"/>
             <w:r>
@@ -16443,16 +16500,8 @@
               <w:rPr>
                 <w:sz w:val="19"/>
               </w:rPr>
-              <w:t>/</w:t>
-            </w:r>
-            <w:proofErr w:type="gramStart"/>
-            <w:r>
-              <w:rPr>
-                <w:sz w:val="19"/>
-              </w:rPr>
-              <w:t>login</w:t>
-            </w:r>
-            <w:proofErr w:type="gramEnd"/>
+              <w:t>/login</w:t>
+            </w:r>
           </w:p>
         </w:tc>
         <w:tc>
@@ -16594,21 +16643,7 @@
               <w:rPr>
                 <w:sz w:val="19"/>
               </w:rPr>
-              <w:t>/</w:t>
-            </w:r>
-            <w:proofErr w:type="gramStart"/>
-            <w:r>
-              <w:rPr>
-                <w:sz w:val="19"/>
-              </w:rPr>
-              <w:t>live</w:t>
-            </w:r>
-            <w:proofErr w:type="gramEnd"/>
-            <w:r>
-              <w:rPr>
-                <w:sz w:val="19"/>
-              </w:rPr>
-              <w:t>-demo</w:t>
+              <w:t>/live-demo</w:t>
             </w:r>
           </w:p>
         </w:tc>
@@ -16665,21 +16700,7 @@
               <w:rPr>
                 <w:sz w:val="19"/>
               </w:rPr>
-              <w:t xml:space="preserve">Real-time manual turn </w:t>
-            </w:r>
-            <w:proofErr w:type="gramStart"/>
-            <w:r>
-              <w:rPr>
-                <w:sz w:val="19"/>
-              </w:rPr>
-              <w:t>append</w:t>
-            </w:r>
-            <w:proofErr w:type="gramEnd"/>
-            <w:r>
-              <w:rPr>
-                <w:sz w:val="19"/>
-              </w:rPr>
-              <w:t xml:space="preserve"> for live conversations</w:t>
+              <w:t>Real-time manual turn append for live conversations</w:t>
             </w:r>
           </w:p>
         </w:tc>
@@ -16711,16 +16732,8 @@
               <w:rPr>
                 <w:sz w:val="19"/>
               </w:rPr>
-              <w:t>/</w:t>
-            </w:r>
-            <w:proofErr w:type="gramStart"/>
-            <w:r>
-              <w:rPr>
-                <w:sz w:val="19"/>
-              </w:rPr>
-              <w:t>assistant</w:t>
-            </w:r>
-            <w:proofErr w:type="gramEnd"/>
+              <w:t>/assistant</w:t>
+            </w:r>
           </w:p>
         </w:tc>
         <w:tc>
@@ -16808,16 +16821,8 @@
               <w:rPr>
                 <w:sz w:val="19"/>
               </w:rPr>
-              <w:t>/</w:t>
-            </w:r>
-            <w:proofErr w:type="gramStart"/>
-            <w:r>
-              <w:rPr>
-                <w:sz w:val="19"/>
-              </w:rPr>
-              <w:t>admin</w:t>
-            </w:r>
-            <w:proofErr w:type="gramEnd"/>
+              <w:t>/admin</w:t>
+            </w:r>
           </w:p>
         </w:tc>
         <w:tc>
@@ -16999,7 +17004,23 @@
         <w:ind w:left="432"/>
       </w:pPr>
       <w:r>
-        <w:t>recurrence_engine.py — groups recurring issues across conversations and agents; identifies patterns [</w:t>
+        <w:t xml:space="preserve">recurrence_engine.py — </w:t>
+      </w:r>
+      <w:proofErr w:type="spellStart"/>
+      <w:r>
+        <w:t>grou</w:t>
+      </w:r>
+      <w:proofErr w:type="spellEnd"/>
+      <w:r>
+        <w:tab/>
+      </w:r>
+      <w:proofErr w:type="spellStart"/>
+      <w:r>
+        <w:t>ps</w:t>
+      </w:r>
+      <w:proofErr w:type="spellEnd"/>
+      <w:r>
+        <w:t xml:space="preserve"> recurring issues across conversations and agents; identifies patterns [</w:t>
       </w:r>
       <w:proofErr w:type="spellStart"/>
       <w:r>
@@ -17240,26 +17261,13 @@
         <w:ind w:left="432"/>
       </w:pPr>
       <w:r>
-        <w:t>Secrets in environment variables only</w:t>
-      </w:r>
-      <w:proofErr w:type="gramStart"/>
-      <w:r>
-        <w:t>; .env</w:t>
-      </w:r>
-      <w:proofErr w:type="gramEnd"/>
-      <w:r>
-        <w:t xml:space="preserve"> </w:t>
-      </w:r>
-      <w:proofErr w:type="gramStart"/>
-      <w:r>
-        <w:t>in .</w:t>
+        <w:t>Secrets in environment variables only; .env in .</w:t>
       </w:r>
       <w:proofErr w:type="spellStart"/>
       <w:r>
         <w:t>gitignore</w:t>
       </w:r>
       <w:proofErr w:type="spellEnd"/>
-      <w:proofErr w:type="gramEnd"/>
     </w:p>
     <w:p>
       <w:r>
@@ -18078,31 +18086,14 @@
           <w:color w:val="2E75B6"/>
           <w:sz w:val="20"/>
         </w:rPr>
-        <w:t xml:space="preserve">[Why this </w:t>
-      </w:r>
-      <w:proofErr w:type="gramStart"/>
-      <w:r>
-        <w:rPr>
-          <w:b/>
-          <w:color w:val="2E75B6"/>
-          <w:sz w:val="20"/>
-        </w:rPr>
-        <w:t xml:space="preserve">matters]  </w:t>
+        <w:t xml:space="preserve">[Why this matters]  </w:t>
       </w:r>
       <w:r>
         <w:rPr>
           <w:i/>
           <w:sz w:val="20"/>
         </w:rPr>
-        <w:t>F</w:t>
-      </w:r>
-      <w:proofErr w:type="gramEnd"/>
-      <w:r>
-        <w:rPr>
-          <w:i/>
-          <w:sz w:val="20"/>
-        </w:rPr>
-        <w:t>1 metrics require human annotation of the gold workbook (evals/gold_workbook.csv) using evals/rubric.md. Until that annotation is done, the only validated metrics are the unit-test results (QA scorer correctness on synthetic fixtures) and the automated leakage check (pass/fail).</w:t>
+        <w:t>F1 metrics require human annotation of the gold workbook (evals/gold_workbook.csv) using evals/rubric.md. Until that annotation is done, the only validated metrics are the unit-test results (QA scorer correctness on synthetic fixtures) and the automated leakage check (pass/fail).</w:t>
       </w:r>
     </w:p>
     <w:p/>
@@ -18119,12 +18110,10 @@
         <w:t xml:space="preserve">The system is deployed on Render (free tier) for the backend and Vercel for the frontend. The </w:t>
       </w:r>
       <w:proofErr w:type="spellStart"/>
-      <w:proofErr w:type="gramStart"/>
       <w:r>
         <w:t>render.yaml</w:t>
       </w:r>
       <w:proofErr w:type="spellEnd"/>
-      <w:proofErr w:type="gramEnd"/>
       <w:r>
         <w:t xml:space="preserve"> defines a Docker web service using backend/</w:t>
       </w:r>
@@ -18137,12 +18126,10 @@
         <w:t xml:space="preserve"> with health check at /health. PostgreSQL is provided by Render's managed free-tier database. SEED_DEMO_DATA=true causes the full demo dataset to be seeded on startup via the action_layer/demo_seeder.py path. The Vercel frontend is a static Vite build with SPA routing handled by </w:t>
       </w:r>
       <w:proofErr w:type="spellStart"/>
-      <w:proofErr w:type="gramStart"/>
       <w:r>
         <w:t>vercel.json</w:t>
       </w:r>
       <w:proofErr w:type="spellEnd"/>
-      <w:proofErr w:type="gramEnd"/>
       <w:r>
         <w:t>.</w:t>
       </w:r>
@@ -20616,19 +20603,11 @@
             <w:tcW w:w="3041" w:type="dxa"/>
           </w:tcPr>
           <w:p>
-            <w:proofErr w:type="gramStart"/>
-            <w:r>
-              <w:rPr>
-                <w:sz w:val="19"/>
-              </w:rPr>
-              <w:t>Users</w:t>
-            </w:r>
-            <w:proofErr w:type="gramEnd"/>
-            <w:r>
-              <w:rPr>
-                <w:sz w:val="19"/>
-              </w:rPr>
-              <w:t xml:space="preserve"> re-login every 30 minutes</w:t>
+            <w:r>
+              <w:rPr>
+                <w:sz w:val="19"/>
+              </w:rPr>
+              <w:t>Users re-login every 30 minutes</w:t>
             </w:r>
           </w:p>
         </w:tc>
@@ -22969,30 +22948,8 @@
               <w:rPr>
                 <w:sz w:val="19"/>
               </w:rPr>
-              <w:t>localhost:</w:t>
-            </w:r>
-            <w:proofErr w:type="gramStart"/>
-            <w:r>
-              <w:rPr>
-                <w:sz w:val="19"/>
-              </w:rPr>
-              <w:t>3000,localhost</w:t>
-            </w:r>
-            <w:proofErr w:type="gramEnd"/>
-            <w:r>
-              <w:rPr>
-                <w:sz w:val="19"/>
-              </w:rPr>
-              <w:t>:</w:t>
-            </w:r>
-            <w:proofErr w:type="gramStart"/>
-            <w:r>
-              <w:rPr>
-                <w:sz w:val="19"/>
-              </w:rPr>
-              <w:t>5173,vercel.app</w:t>
-            </w:r>
-            <w:proofErr w:type="gramEnd"/>
+              <w:t>localhost:3000,localhost:5173,vercel.app</w:t>
+            </w:r>
           </w:p>
         </w:tc>
         <w:tc>
@@ -23031,40 +22988,18 @@
           </w:tcPr>
           <w:p>
             <w:proofErr w:type="spellStart"/>
-            <w:proofErr w:type="gramStart"/>
-            <w:r>
-              <w:rPr>
-                <w:sz w:val="19"/>
-              </w:rPr>
-              <w:t>username:password</w:t>
-            </w:r>
-            <w:proofErr w:type="gramEnd"/>
-            <w:r>
-              <w:rPr>
-                <w:sz w:val="19"/>
-              </w:rPr>
-              <w:t>:</w:t>
-            </w:r>
-            <w:proofErr w:type="gramStart"/>
-            <w:r>
-              <w:rPr>
-                <w:sz w:val="19"/>
-              </w:rPr>
-              <w:t>role</w:t>
+            <w:r>
+              <w:rPr>
+                <w:sz w:val="19"/>
+              </w:rPr>
+              <w:t>username:password:role</w:t>
             </w:r>
             <w:proofErr w:type="spellEnd"/>
             <w:r>
               <w:rPr>
                 <w:sz w:val="19"/>
               </w:rPr>
-              <w:t>,...</w:t>
-            </w:r>
-            <w:proofErr w:type="gramEnd"/>
-            <w:r>
-              <w:rPr>
-                <w:sz w:val="19"/>
-              </w:rPr>
-              <w:t xml:space="preserve"> for startup seeding</w:t>
+              <w:t>,... for startup seeding</w:t>
             </w:r>
           </w:p>
         </w:tc>
@@ -23075,29 +23010,13 @@
           </w:tcPr>
           <w:p>
             <w:proofErr w:type="spellStart"/>
-            <w:proofErr w:type="gramStart"/>
-            <w:r>
-              <w:rPr>
-                <w:sz w:val="19"/>
-              </w:rPr>
-              <w:t>admin:changeme</w:t>
-            </w:r>
-            <w:proofErr w:type="gramEnd"/>
-            <w:r>
-              <w:rPr>
-                <w:sz w:val="19"/>
-              </w:rPr>
-              <w:t>_</w:t>
-            </w:r>
-            <w:proofErr w:type="gramStart"/>
-            <w:r>
-              <w:rPr>
-                <w:sz w:val="19"/>
-              </w:rPr>
-              <w:t>admin:admin</w:t>
+            <w:r>
+              <w:rPr>
+                <w:sz w:val="19"/>
+              </w:rPr>
+              <w:t>admin:changeme_admin:admin</w:t>
             </w:r>
             <w:proofErr w:type="spellEnd"/>
-            <w:proofErr w:type="gramEnd"/>
           </w:p>
         </w:tc>
         <w:tc>
@@ -23433,31 +23352,9 @@
               <w:rPr>
                 <w:sz w:val="19"/>
               </w:rPr>
-              <w:t>prohibited_</w:t>
-            </w:r>
-            <w:proofErr w:type="gramStart"/>
-            <w:r>
-              <w:rPr>
-                <w:sz w:val="19"/>
-              </w:rPr>
-              <w:t>promises,identity</w:t>
-            </w:r>
-            <w:proofErr w:type="gramEnd"/>
-            <w:r>
-              <w:rPr>
-                <w:sz w:val="19"/>
-              </w:rPr>
-              <w:t>_</w:t>
-            </w:r>
-            <w:proofErr w:type="gramStart"/>
-            <w:r>
-              <w:rPr>
-                <w:sz w:val="19"/>
-              </w:rPr>
-              <w:t>verification,disclosure</w:t>
+              <w:t>prohibited_promises,identity_verification,disclosure</w:t>
             </w:r>
             <w:proofErr w:type="spellEnd"/>
-            <w:proofErr w:type="gramEnd"/>
           </w:p>
         </w:tc>
         <w:tc>
@@ -23679,13 +23576,8 @@
         <w:t xml:space="preserve">SHA-256 of the redacted turn text, stored in </w:t>
       </w:r>
       <w:proofErr w:type="spellStart"/>
-      <w:proofErr w:type="gramStart"/>
-      <w:r>
-        <w:t>turns.content</w:t>
-      </w:r>
-      <w:proofErr w:type="gramEnd"/>
-      <w:r>
-        <w:t>_hash</w:t>
+      <w:r>
+        <w:t>turns.content_hash</w:t>
       </w:r>
       <w:proofErr w:type="spellEnd"/>
       <w:r>
@@ -23735,15 +23627,7 @@
         <w:t xml:space="preserve">Critical violation: </w:t>
       </w:r>
       <w:r>
-        <w:t xml:space="preserve">A </w:t>
-      </w:r>
-      <w:proofErr w:type="gramStart"/>
-      <w:r>
-        <w:t>fail</w:t>
-      </w:r>
-      <w:proofErr w:type="gramEnd"/>
-      <w:r>
-        <w:t xml:space="preserve"> result on a critical QA item (</w:t>
+        <w:t>A fail result on a critical QA item (</w:t>
       </w:r>
       <w:proofErr w:type="spellStart"/>
       <w:r>
@@ -23793,15 +23677,7 @@
         <w:t xml:space="preserve">Idempotency key: </w:t>
       </w:r>
       <w:r>
-        <w:t xml:space="preserve">A caller-supplied string on turn </w:t>
-      </w:r>
-      <w:proofErr w:type="gramStart"/>
-      <w:r>
-        <w:t>append</w:t>
-      </w:r>
-      <w:proofErr w:type="gramEnd"/>
-      <w:r>
-        <w:t xml:space="preserve"> requests. If a turn with the same key exists, the existing turn is returned instead of creating a duplicate. Safe for retries.</w:t>
+        <w:t>A caller-supplied string on turn append requests. If a turn with the same key exists, the existing turn is returned instead of creating a duplicate. Safe for retries.</w:t>
       </w:r>
     </w:p>
     <w:p>
@@ -23883,13 +23759,8 @@
         <w:t xml:space="preserve">The running state accumulated by the reducer after each turn append. Stored in </w:t>
       </w:r>
       <w:proofErr w:type="spellStart"/>
-      <w:proofErr w:type="gramStart"/>
-      <w:r>
-        <w:t>conversations.provisional</w:t>
-      </w:r>
-      <w:proofErr w:type="gramEnd"/>
-      <w:r>
-        <w:t>_state_json</w:t>
+      <w:r>
+        <w:t>conversations.provisional_state_json</w:t>
       </w:r>
       <w:proofErr w:type="spellEnd"/>
       <w:r>
@@ -23994,13 +23865,8 @@
         <w:t xml:space="preserve">A string like turn_0001 identifying a turn within a conversation by its sequence number. Format defined in </w:t>
       </w:r>
       <w:proofErr w:type="spellStart"/>
-      <w:proofErr w:type="gramStart"/>
-      <w:r>
-        <w:t>domain_model.py:TURN</w:t>
-      </w:r>
-      <w:proofErr w:type="gramEnd"/>
-      <w:r>
-        <w:t>_ID_FORMAT</w:t>
+      <w:r>
+        <w:t>domain_model.py:TURN_ID_FORMAT</w:t>
       </w:r>
       <w:proofErr w:type="spellEnd"/>
       <w:r>
@@ -24172,7 +24038,7 @@
   <w:abstractNum w:abstractNumId="8" w15:restartNumberingAfterBreak="0">
     <w:nsid w:val="FFFFFF89"/>
     <w:multiLevelType w:val="singleLevel"/>
-    <w:tmpl w:val="745C905A"/>
+    <w:tmpl w:val="98FEE972"/>
     <w:lvl w:ilvl="0">
       <w:start w:val="1"/>
       <w:numFmt w:val="bullet"/>

</xml_diff>